<commit_message>
feat(invoice): kelib chiqish xatida adresat va viloyat filialga qarab
Oltiariq filialida Ферганаэкспертиза / Камалову Ш.Н. va "Ферганской
области", boshqa filiallarda Наманганэкспертиза / Мусаеву Ш.М. va
"Наманганской области". Shablonga $filial$, $filial_direktori$,
$viloyat$ teglari qo'shildi; PDF ham shu qiymatlardan foydalanadi.

Co-Authored-By: Claude Opus 5.5 <noreply@anthropic.com>
</commit_message>
<xml_diff>
--- a/backend/templates/Информация_о_происхождении_товара.docx
+++ b/backend/templates/Информация_о_происхождении_товара.docx
@@ -107,7 +107,6 @@
         </w:rPr>
         <w:t>$</w:t>
       </w:r>
-      <w:proofErr w:type="spellStart"/>
       <w:r>
         <w:rPr>
           <w:bCs/>
@@ -115,7 +114,6 @@
         </w:rPr>
         <w:t>Invoys</w:t>
       </w:r>
-      <w:proofErr w:type="spellEnd"/>
       <w:r>
         <w:rPr>
           <w:bCs/>
@@ -184,19 +182,32 @@
         </w:rPr>
         <w:t>ДХО ООО «</w:t>
       </w:r>
-      <w:proofErr w:type="spellStart"/>
       <w:r>
         <w:rPr>
           <w:b/>
           <w:bCs/>
         </w:rPr>
-        <w:t>Наманганэкспертиза</w:t>
-      </w:r>
-      <w:proofErr w:type="spellEnd"/>
+        <w:t>$</w:t>
+      </w:r>
       <w:r>
         <w:rPr>
           <w:b/>
           <w:bCs/>
+          <w:lang w:val="en-US"/>
+        </w:rPr>
+        <w:t>filial</w:t>
+      </w:r>
+      <w:r>
+        <w:rPr>
+          <w:b/>
+          <w:bCs/>
+        </w:rPr>
+        <w:t>$</w:t>
+      </w:r>
+      <w:r>
+        <w:rPr>
+          <w:b/>
+          <w:bCs/>
         </w:rPr>
         <w:t>»</w:t>
       </w:r>
@@ -208,7 +219,22 @@
           <w:b/>
           <w:bCs/>
         </w:rPr>
-        <w:t>Мусаеву Ш.М.</w:t>
+        <w:t>$</w:t>
+      </w:r>
+      <w:r>
+        <w:rPr>
+          <w:b/>
+          <w:bCs/>
+          <w:lang w:val="en-US"/>
+        </w:rPr>
+        <w:t>filial_direktori</w:t>
+      </w:r>
+      <w:r>
+        <w:rPr>
+          <w:b/>
+          <w:bCs/>
+        </w:rPr>
+        <w:t>$</w:t>
       </w:r>
     </w:p>
     <w:p>
@@ -269,7 +295,6 @@
         </w:rPr>
         <w:t>$</w:t>
       </w:r>
-      <w:proofErr w:type="spellStart"/>
       <w:r>
         <w:rPr>
           <w:b/>
@@ -277,14 +302,12 @@
         </w:rPr>
         <w:t>eksportyor</w:t>
       </w:r>
-      <w:proofErr w:type="spellEnd"/>
       <w:r>
         <w:rPr>
           <w:b/>
         </w:rPr>
         <w:t>_</w:t>
       </w:r>
-      <w:proofErr w:type="spellStart"/>
       <w:r>
         <w:rPr>
           <w:b/>
@@ -292,7 +315,6 @@
         </w:rPr>
         <w:t>nomi</w:t>
       </w:r>
-      <w:proofErr w:type="spellEnd"/>
       <w:r>
         <w:rPr>
           <w:b/>
@@ -350,25 +372,21 @@
       <w:r>
         <w:t>$</w:t>
       </w:r>
-      <w:proofErr w:type="spellStart"/>
       <w:r>
         <w:rPr>
           <w:lang w:val="en-US"/>
         </w:rPr>
         <w:t>tovar</w:t>
       </w:r>
-      <w:proofErr w:type="spellEnd"/>
       <w:r>
         <w:t>_</w:t>
       </w:r>
-      <w:proofErr w:type="spellStart"/>
       <w:r>
         <w:rPr>
           <w:lang w:val="en-US"/>
         </w:rPr>
         <w:t>nomi</w:t>
       </w:r>
-      <w:proofErr w:type="spellEnd"/>
       <w:r>
         <w:t>$</w:t>
       </w:r>
@@ -378,25 +396,21 @@
       <w:r>
         <w:t>$</w:t>
       </w:r>
-      <w:proofErr w:type="spellStart"/>
       <w:r>
         <w:rPr>
           <w:lang w:val="en-US"/>
         </w:rPr>
         <w:t>qadoq</w:t>
       </w:r>
-      <w:proofErr w:type="spellEnd"/>
       <w:r>
         <w:t>_</w:t>
       </w:r>
-      <w:proofErr w:type="spellStart"/>
       <w:r>
         <w:rPr>
           <w:lang w:val="en-US"/>
         </w:rPr>
         <w:t>soni</w:t>
       </w:r>
-      <w:proofErr w:type="spellEnd"/>
       <w:r>
         <w:t>$</w:t>
       </w:r>
@@ -406,25 +420,21 @@
       <w:r>
         <w:t>$</w:t>
       </w:r>
-      <w:proofErr w:type="spellStart"/>
       <w:r>
         <w:rPr>
           <w:lang w:val="en-US"/>
         </w:rPr>
         <w:t>qadoq</w:t>
       </w:r>
-      <w:proofErr w:type="spellEnd"/>
       <w:r>
         <w:t>_</w:t>
       </w:r>
-      <w:proofErr w:type="spellStart"/>
       <w:r>
         <w:rPr>
           <w:lang w:val="en-US"/>
         </w:rPr>
         <w:t>turi</w:t>
       </w:r>
-      <w:proofErr w:type="spellEnd"/>
       <w:r>
         <w:t>$</w:t>
       </w:r>
@@ -434,14 +444,12 @@
       <w:r>
         <w:t>$</w:t>
       </w:r>
-      <w:proofErr w:type="spellStart"/>
       <w:r>
         <w:rPr>
           <w:lang w:val="en-US"/>
         </w:rPr>
         <w:t>brutto</w:t>
       </w:r>
-      <w:proofErr w:type="spellEnd"/>
       <w:r>
         <w:t>$</w:t>
       </w:r>
@@ -451,14 +459,12 @@
       <w:r>
         <w:t>$</w:t>
       </w:r>
-      <w:proofErr w:type="spellStart"/>
       <w:r>
         <w:rPr>
           <w:lang w:val="en-US"/>
         </w:rPr>
         <w:t>netto</w:t>
       </w:r>
-      <w:proofErr w:type="spellEnd"/>
       <w:r>
         <w:t>$</w:t>
       </w:r>
@@ -492,25 +498,21 @@
       <w:r>
         <w:t>$</w:t>
       </w:r>
-      <w:proofErr w:type="spellStart"/>
       <w:r>
         <w:rPr>
           <w:lang w:val="en-US"/>
         </w:rPr>
         <w:t>invoys</w:t>
       </w:r>
-      <w:proofErr w:type="spellEnd"/>
       <w:r>
         <w:t>_</w:t>
       </w:r>
-      <w:proofErr w:type="spellStart"/>
       <w:r>
         <w:rPr>
           <w:lang w:val="en-US"/>
         </w:rPr>
         <w:t>raqam</w:t>
       </w:r>
-      <w:proofErr w:type="spellEnd"/>
       <w:r>
         <w:t>$</w:t>
       </w:r>
@@ -523,7 +525,6 @@
         </w:rPr>
         <w:t>$</w:t>
       </w:r>
-      <w:proofErr w:type="spellStart"/>
       <w:r>
         <w:rPr>
           <w:bCs/>
@@ -531,7 +532,6 @@
         </w:rPr>
         <w:t>Invoys</w:t>
       </w:r>
-      <w:proofErr w:type="spellEnd"/>
       <w:r>
         <w:rPr>
           <w:bCs/>
@@ -576,7 +576,7 @@
         <w:t>ы</w:t>
       </w:r>
       <w:r>
-        <w:t xml:space="preserve"> у населения Наманганской области Республики Узбекистан.</w:t>
+        <w:t xml:space="preserve"> у населения $viloyat$ Республики Узбекистан.</w:t>
       </w:r>
     </w:p>
     <w:p>
@@ -606,7 +606,6 @@
         </w:rPr>
         <w:t>$</w:t>
       </w:r>
-      <w:proofErr w:type="spellStart"/>
       <w:r>
         <w:rPr>
           <w:b/>
@@ -614,14 +613,12 @@
         </w:rPr>
         <w:t>eksportyor</w:t>
       </w:r>
-      <w:proofErr w:type="spellEnd"/>
       <w:r>
         <w:rPr>
           <w:b/>
         </w:rPr>
         <w:t>_</w:t>
       </w:r>
-      <w:proofErr w:type="spellStart"/>
       <w:r>
         <w:rPr>
           <w:b/>
@@ -629,7 +626,6 @@
         </w:rPr>
         <w:t>nomi</w:t>
       </w:r>
-      <w:proofErr w:type="spellEnd"/>
       <w:r>
         <w:rPr>
           <w:b/>
@@ -663,21 +659,7 @@
         <w:rPr>
           <w:b/>
         </w:rPr>
-        <w:t>$</w:t>
-      </w:r>
-      <w:proofErr w:type="spellStart"/>
-      <w:r>
-        <w:rPr>
-          <w:b/>
-        </w:rPr>
-        <w:t>eksportyor_nomi</w:t>
-      </w:r>
-      <w:proofErr w:type="spellEnd"/>
-      <w:r>
-        <w:rPr>
-          <w:b/>
-        </w:rPr>
-        <w:t>$</w:t>
+        <w:t>$eksportyor_nomi$</w:t>
       </w:r>
       <w:r>
         <w:t xml:space="preserve">, </w:t>
@@ -728,37 +710,21 @@
         <w:rPr>
           <w:b/>
           <w:bCs/>
-          <w:lang w:val="en-US"/>
-        </w:rPr>
-      </w:pPr>
-      <w:r>
-        <w:rPr>
-          <w:lang w:val="en-US"/>
-        </w:rPr>
+        </w:rPr>
+      </w:pPr>
+      <w:r>
         <w:tab/>
       </w:r>
       <w:r>
-        <w:rPr>
-          <w:lang w:val="en-US"/>
-        </w:rPr>
         <w:tab/>
       </w:r>
       <w:r>
-        <w:rPr>
-          <w:lang w:val="en-US"/>
-        </w:rPr>
         <w:tab/>
       </w:r>
       <w:r>
-        <w:rPr>
-          <w:lang w:val="en-US"/>
-        </w:rPr>
         <w:t xml:space="preserve">                                </w:t>
       </w:r>
       <w:r>
-        <w:rPr>
-          <w:lang w:val="en-US"/>
-        </w:rPr>
         <w:t xml:space="preserve">                         </w:t>
       </w:r>
     </w:p>
@@ -768,7 +734,6 @@
         <w:rPr>
           <w:b/>
           <w:bCs/>
-          <w:lang w:val="en-US"/>
         </w:rPr>
       </w:pPr>
     </w:p>
@@ -823,23 +788,7 @@
                 <w:b/>
                 <w:lang w:val="en-US"/>
               </w:rPr>
-              <w:t>$</w:t>
-            </w:r>
-            <w:proofErr w:type="spellStart"/>
-            <w:r>
-              <w:rPr>
-                <w:b/>
-                <w:lang w:val="en-US"/>
-              </w:rPr>
-              <w:t>eksportyor_nomi</w:t>
-            </w:r>
-            <w:proofErr w:type="spellEnd"/>
-            <w:r>
-              <w:rPr>
-                <w:b/>
-                <w:lang w:val="en-US"/>
-              </w:rPr>
-              <w:t>$:</w:t>
+              <w:t>$eksportyor_nomi$:</w:t>
             </w:r>
           </w:p>
         </w:tc>
@@ -859,39 +808,7 @@
                 <w:b/>
                 <w:lang w:val="en-US"/>
               </w:rPr>
-              <w:t>$</w:t>
-            </w:r>
-            <w:proofErr w:type="spellStart"/>
-            <w:r>
-              <w:rPr>
-                <w:b/>
-                <w:lang w:val="en-US"/>
-              </w:rPr>
-              <w:t>Imzo</w:t>
-            </w:r>
-            <w:proofErr w:type="spellEnd"/>
-            <w:r>
-              <w:rPr>
-                <w:b/>
-                <w:lang w:val="en-US"/>
-              </w:rPr>
-              <w:t>$ $</w:t>
-            </w:r>
-            <w:proofErr w:type="spellStart"/>
-            <w:r>
-              <w:rPr>
-                <w:b/>
-                <w:lang w:val="en-US"/>
-              </w:rPr>
-              <w:t>Muhr</w:t>
-            </w:r>
-            <w:proofErr w:type="spellEnd"/>
-            <w:r>
-              <w:rPr>
-                <w:b/>
-                <w:lang w:val="en-US"/>
-              </w:rPr>
-              <w:t>$</w:t>
+              <w:t>$Imzo$ $Muhr$</w:t>
             </w:r>
           </w:p>
         </w:tc>
@@ -913,25 +830,7 @@
                 <w:bCs/>
                 <w:lang w:val="en-US"/>
               </w:rPr>
-              <w:t>$</w:t>
-            </w:r>
-            <w:proofErr w:type="spellStart"/>
-            <w:r>
-              <w:rPr>
-                <w:b/>
-                <w:bCs/>
-                <w:lang w:val="en-US"/>
-              </w:rPr>
-              <w:t>Direktor</w:t>
-            </w:r>
-            <w:proofErr w:type="spellEnd"/>
-            <w:r>
-              <w:rPr>
-                <w:b/>
-                <w:bCs/>
-                <w:lang w:val="en-US"/>
-              </w:rPr>
-              <w:t>$</w:t>
+              <w:t>$Direktor$</w:t>
             </w:r>
           </w:p>
         </w:tc>

</xml_diff>